<commit_message>
docs: add project readme and ignore local documents
</commit_message>
<xml_diff>
--- a/Java后端开发_暑期实习_简历_强化版.docx
+++ b/Java后端开发_暑期实习_简历_强化版.docx
@@ -162,6 +162,60 @@
                 <w:lang w:eastAsia="zh-CN"/>
               </w:rPr>
             </w:pPr>
+            <w:r>
+              <w:rPr>
+                <w:noProof/>
+              </w:rPr>
+              <w:drawing>
+                <wp:anchor distT="0" distB="0" distL="114300" distR="114300" simplePos="0" relativeHeight="251667968" behindDoc="0" locked="0" layoutInCell="1" allowOverlap="1" wp14:anchorId="38EDF486" wp14:editId="0B3E9877">
+                  <wp:simplePos x="0" y="0"/>
+                  <wp:positionH relativeFrom="column">
+                    <wp:posOffset>5123180</wp:posOffset>
+                  </wp:positionH>
+                  <wp:positionV relativeFrom="paragraph">
+                    <wp:posOffset>178363</wp:posOffset>
+                  </wp:positionV>
+                  <wp:extent cx="727710" cy="1019175"/>
+                  <wp:effectExtent l="0" t="0" r="0" b="9525"/>
+                  <wp:wrapNone/>
+                  <wp:docPr id="1726705887" name="图片 2"/>
+                  <wp:cNvGraphicFramePr>
+                    <a:graphicFrameLocks xmlns:a="http://schemas.openxmlformats.org/drawingml/2006/main" noChangeAspect="1"/>
+                  </wp:cNvGraphicFramePr>
+                  <a:graphic xmlns:a="http://schemas.openxmlformats.org/drawingml/2006/main">
+                    <a:graphicData uri="http://schemas.openxmlformats.org/drawingml/2006/picture">
+                      <pic:pic xmlns:pic="http://schemas.openxmlformats.org/drawingml/2006/picture">
+                        <pic:nvPicPr>
+                          <pic:cNvPr id="1726705887" name="图片 1726705887"/>
+                          <pic:cNvPicPr/>
+                        </pic:nvPicPr>
+                        <pic:blipFill>
+                          <a:blip r:embed="rId8"/>
+                          <a:stretch>
+                            <a:fillRect/>
+                          </a:stretch>
+                        </pic:blipFill>
+                        <pic:spPr>
+                          <a:xfrm>
+                            <a:off x="0" y="0"/>
+                            <a:ext cx="727710" cy="1019175"/>
+                          </a:xfrm>
+                          <a:prstGeom prst="rect">
+                            <a:avLst/>
+                          </a:prstGeom>
+                        </pic:spPr>
+                      </pic:pic>
+                    </a:graphicData>
+                  </a:graphic>
+                  <wp14:sizeRelH relativeFrom="margin">
+                    <wp14:pctWidth>0</wp14:pctWidth>
+                  </wp14:sizeRelH>
+                  <wp14:sizeRelV relativeFrom="margin">
+                    <wp14:pctHeight>0</wp14:pctHeight>
+                  </wp14:sizeRelV>
+                </wp:anchor>
+              </w:drawing>
+            </w:r>
           </w:p>
         </w:tc>
       </w:tr>
@@ -256,65 +310,12 @@
           </w:tcPr>
           <w:p>
             <w:pPr>
-              <w:jc w:val="right"/>
+              <w:ind w:right="640"/>
               <w:rPr>
                 <w:rFonts w:hint="eastAsia"/>
+                <w:lang w:eastAsia="zh-CN"/>
               </w:rPr>
             </w:pPr>
-            <w:r>
-              <w:rPr>
-                <w:noProof/>
-              </w:rPr>
-              <w:drawing>
-                <wp:anchor distT="0" distB="0" distL="114300" distR="114300" simplePos="0" relativeHeight="251660800" behindDoc="0" locked="0" layoutInCell="1" allowOverlap="1" wp14:anchorId="38EDF486" wp14:editId="760B6A6C">
-                  <wp:simplePos x="0" y="0"/>
-                  <wp:positionH relativeFrom="column">
-                    <wp:posOffset>563245</wp:posOffset>
-                  </wp:positionH>
-                  <wp:positionV relativeFrom="paragraph">
-                    <wp:posOffset>-2540</wp:posOffset>
-                  </wp:positionV>
-                  <wp:extent cx="727710" cy="1019175"/>
-                  <wp:effectExtent l="0" t="0" r="0" b="9525"/>
-                  <wp:wrapNone/>
-                  <wp:docPr id="1726705887" name="图片 2"/>
-                  <wp:cNvGraphicFramePr>
-                    <a:graphicFrameLocks xmlns:a="http://schemas.openxmlformats.org/drawingml/2006/main" noChangeAspect="1"/>
-                  </wp:cNvGraphicFramePr>
-                  <a:graphic xmlns:a="http://schemas.openxmlformats.org/drawingml/2006/main">
-                    <a:graphicData uri="http://schemas.openxmlformats.org/drawingml/2006/picture">
-                      <pic:pic xmlns:pic="http://schemas.openxmlformats.org/drawingml/2006/picture">
-                        <pic:nvPicPr>
-                          <pic:cNvPr id="1726705887" name="图片 1726705887"/>
-                          <pic:cNvPicPr/>
-                        </pic:nvPicPr>
-                        <pic:blipFill>
-                          <a:blip r:embed="rId8"/>
-                          <a:stretch>
-                            <a:fillRect/>
-                          </a:stretch>
-                        </pic:blipFill>
-                        <pic:spPr>
-                          <a:xfrm>
-                            <a:off x="0" y="0"/>
-                            <a:ext cx="727710" cy="1019175"/>
-                          </a:xfrm>
-                          <a:prstGeom prst="rect">
-                            <a:avLst/>
-                          </a:prstGeom>
-                        </pic:spPr>
-                      </pic:pic>
-                    </a:graphicData>
-                  </a:graphic>
-                  <wp14:sizeRelH relativeFrom="margin">
-                    <wp14:pctWidth>0</wp14:pctWidth>
-                  </wp14:sizeRelH>
-                  <wp14:sizeRelV relativeFrom="margin">
-                    <wp14:pctHeight>0</wp14:pctHeight>
-                  </wp14:sizeRelV>
-                </wp:anchor>
-              </w:drawing>
-            </w:r>
           </w:p>
         </w:tc>
       </w:tr>
@@ -1124,6 +1125,7 @@
             <w:pPr>
               <w:rPr>
                 <w:rFonts w:hint="eastAsia"/>
+                <w:lang w:eastAsia="zh-CN"/>
               </w:rPr>
             </w:pPr>
             <w:proofErr w:type="spellStart"/>
@@ -1151,6 +1153,23 @@
               <w:t>智能体平台</w:t>
             </w:r>
             <w:proofErr w:type="spellEnd"/>
+            <w:r>
+              <w:rPr>
+                <w:rFonts w:hint="eastAsia"/>
+                <w:b/>
+                <w:sz w:val="17"/>
+                <w:lang w:eastAsia="zh-CN"/>
+              </w:rPr>
+              <w:t xml:space="preserve">    </w:t>
+            </w:r>
+            <w:r>
+              <w:rPr>
+                <w:b/>
+                <w:sz w:val="17"/>
+                <w:lang w:eastAsia="zh-CN"/>
+              </w:rPr>
+              <w:t>https://github.com/314159first/Agent</w:t>
+            </w:r>
           </w:p>
         </w:tc>
         <w:tc>
@@ -1519,24 +1538,19 @@
         <w:tblLook w:val="04A0" w:firstRow="1" w:lastRow="0" w:firstColumn="1" w:lastColumn="0" w:noHBand="0" w:noVBand="1"/>
       </w:tblPr>
       <w:tblGrid>
-        <w:gridCol w:w="5515"/>
-        <w:gridCol w:w="5515"/>
+        <w:gridCol w:w="2943"/>
+        <w:gridCol w:w="8087"/>
       </w:tblGrid>
       <w:tr>
         <w:tc>
           <w:tcPr>
-            <w:tcW w:w="5515" w:type="dxa"/>
-            <w:tcBorders>
-              <w:top w:val="nil"/>
-              <w:left w:val="nil"/>
-              <w:bottom w:val="nil"/>
-              <w:right w:val="nil"/>
-            </w:tcBorders>
+            <w:tcW w:w="2943" w:type="dxa"/>
           </w:tcPr>
           <w:p>
             <w:pPr>
               <w:rPr>
                 <w:rFonts w:hint="eastAsia"/>
+                <w:lang w:eastAsia="zh-CN"/>
               </w:rPr>
             </w:pPr>
             <w:r>
@@ -1555,30 +1569,35 @@
               <w:t>仿抖音短视频平台</w:t>
             </w:r>
             <w:proofErr w:type="spellEnd"/>
+            <w:r>
+              <w:rPr>
+                <w:rFonts w:hint="eastAsia"/>
+                <w:b/>
+                <w:sz w:val="17"/>
+                <w:lang w:eastAsia="zh-CN"/>
+              </w:rPr>
+              <w:t xml:space="preserve">   </w:t>
+            </w:r>
           </w:p>
         </w:tc>
         <w:tc>
           <w:tcPr>
-            <w:tcW w:w="5515" w:type="dxa"/>
-            <w:tcBorders>
-              <w:top w:val="nil"/>
-              <w:left w:val="nil"/>
-              <w:bottom w:val="nil"/>
-              <w:right w:val="nil"/>
-            </w:tcBorders>
+            <w:tcW w:w="8087" w:type="dxa"/>
           </w:tcPr>
           <w:p>
             <w:pPr>
-              <w:jc w:val="right"/>
+              <w:ind w:right="320"/>
               <w:rPr>
                 <w:rFonts w:hint="eastAsia"/>
               </w:rPr>
             </w:pPr>
             <w:r>
               <w:rPr>
+                <w:b/>
                 <w:sz w:val="17"/>
+                <w:lang w:eastAsia="zh-CN"/>
               </w:rPr>
-              <w:t>2025.xx - 2026.xx</w:t>
+              <w:t>https://github.com/314159first/lucky_journey</w:t>
             </w:r>
           </w:p>
         </w:tc>
@@ -13664,6 +13683,18 @@
       <w:shd w:val="clear" w:color="auto" w:fill="E1DFDD"/>
     </w:rPr>
   </w:style>
+  <w:style w:type="character" w:styleId="affb">
+    <w:name w:val="FollowedHyperlink"/>
+    <w:basedOn w:val="a2"/>
+    <w:uiPriority w:val="99"/>
+    <w:semiHidden/>
+    <w:unhideWhenUsed/>
+    <w:rsid w:val="0068597A"/>
+    <w:rPr>
+      <w:color w:val="800080" w:themeColor="followedHyperlink"/>
+      <w:u w:val="single"/>
+    </w:rPr>
+  </w:style>
 </w:styles>
 </file>
 

</xml_diff>